<commit_message>
restruktur packing and inventory flow and logic
</commit_message>
<xml_diff>
--- a/pracindo_backend_v1/akunting/templates_dokumen/master_doc_po.docx
+++ b/pracindo_backend_v1/akunting/templates_dokumen/master_doc_po.docx
@@ -132,14 +132,12 @@
         </w:rPr>
         <w:t xml:space="preserve"> </w:t>
       </w:r>
-      <w:proofErr w:type="spellStart"/>
       <w:r>
         <w:rPr>
           <w:b/>
         </w:rPr>
         <w:t>Ciakar</w:t>
       </w:r>
-      <w:proofErr w:type="spellEnd"/>
       <w:r>
         <w:rPr>
           <w:b/>
@@ -147,19 +145,11 @@
         </w:rPr>
         <w:t xml:space="preserve"> </w:t>
       </w:r>
-      <w:proofErr w:type="spellStart"/>
-      <w:r>
-        <w:rPr>
-          <w:b/>
-        </w:rPr>
-        <w:t>Cileles</w:t>
-      </w:r>
-      <w:proofErr w:type="spellEnd"/>
-      <w:r>
-        <w:rPr>
-          <w:b/>
-        </w:rPr>
-        <w:t>,</w:t>
+      <w:r>
+        <w:rPr>
+          <w:b/>
+        </w:rPr>
+        <w:t>Cileles,</w:t>
       </w:r>
       <w:r>
         <w:rPr>
@@ -233,19 +223,11 @@
         </w:rPr>
         <w:t xml:space="preserve"> </w:t>
       </w:r>
-      <w:proofErr w:type="spellStart"/>
-      <w:r>
-        <w:rPr>
-          <w:b/>
-        </w:rPr>
-        <w:t>Cileles</w:t>
-      </w:r>
-      <w:proofErr w:type="spellEnd"/>
-      <w:r>
-        <w:rPr>
-          <w:b/>
-        </w:rPr>
-        <w:t>,</w:t>
+      <w:r>
+        <w:rPr>
+          <w:b/>
+        </w:rPr>
+        <w:t>Cileles,</w:t>
       </w:r>
       <w:r>
         <w:rPr>
@@ -404,15 +386,7 @@
         </w:rPr>
       </w:pPr>
       <w:r>
-        <w:t xml:space="preserve">Kepada </w:t>
-      </w:r>
-      <w:proofErr w:type="spellStart"/>
-      <w:r>
-        <w:t>Yth</w:t>
-      </w:r>
-      <w:proofErr w:type="spellEnd"/>
-      <w:r>
-        <w:t xml:space="preserve"> </w:t>
+        <w:t xml:space="preserve">Kepada Yth </w:t>
       </w:r>
       <w:r>
         <w:rPr>
@@ -466,11 +440,9 @@
         <w:pStyle w:val="TeksIsi"/>
         <w:ind w:left="1015"/>
       </w:pPr>
-      <w:proofErr w:type="spellStart"/>
       <w:r>
         <w:t>No</w:t>
       </w:r>
-      <w:proofErr w:type="spellEnd"/>
       <w:r>
         <w:rPr>
           <w:spacing w:val="-9"/>
@@ -644,19 +616,11 @@
         </w:rPr>
         <w:t xml:space="preserve"> </w:t>
       </w:r>
-      <w:proofErr w:type="spellStart"/>
       <w:r>
         <w:rPr>
           <w:spacing w:val="-4"/>
         </w:rPr>
-        <w:t>sbb</w:t>
-      </w:r>
-      <w:proofErr w:type="spellEnd"/>
-      <w:r>
-        <w:rPr>
-          <w:spacing w:val="-4"/>
-        </w:rPr>
-        <w:t>.</w:t>
+        <w:t>sbb.</w:t>
       </w:r>
     </w:p>
     <w:p>
@@ -749,31 +713,10 @@
               </w:rPr>
             </w:pPr>
             <w:r>
-              <w:t xml:space="preserve">{% </w:t>
-            </w:r>
-            <w:proofErr w:type="spellStart"/>
-            <w:r>
-              <w:t>for</w:t>
-            </w:r>
-            <w:proofErr w:type="spellEnd"/>
-            <w:r>
-              <w:t xml:space="preserve"> item in </w:t>
-            </w:r>
-            <w:proofErr w:type="spellStart"/>
-            <w:r>
-              <w:t>items</w:t>
-            </w:r>
-            <w:proofErr w:type="spellEnd"/>
-            <w:r>
-              <w:t xml:space="preserve"> %} {{ </w:t>
-            </w:r>
-            <w:proofErr w:type="spellStart"/>
-            <w:r>
-              <w:t>loop.index</w:t>
-            </w:r>
-            <w:proofErr w:type="spellEnd"/>
-            <w:r>
-              <w:t xml:space="preserve"> }}</w:t>
+              <w:rPr>
+                <w:color w:val="000000"/>
+              </w:rPr>
+              <w:t>{%tr for item in items %}</w:t>
             </w:r>
           </w:p>
         </w:tc>
@@ -781,17 +724,32 @@
           <w:tcPr>
             <w:tcW w:w="2160" w:type="dxa"/>
           </w:tcPr>
+          <w:p/>
+        </w:tc>
+        <w:tc>
+          <w:tcPr>
+            <w:tcW w:w="2160" w:type="dxa"/>
+          </w:tcPr>
+          <w:p/>
+        </w:tc>
+        <w:tc>
+          <w:tcPr>
+            <w:tcW w:w="2160" w:type="dxa"/>
+          </w:tcPr>
+          <w:p/>
+        </w:tc>
+      </w:tr>
+      <w:tr>
+        <w:tc>
+          <w:tcPr>
+            <w:tcW w:w="2160" w:type="dxa"/>
+          </w:tcPr>
           <w:p>
             <w:r>
-              <w:t xml:space="preserve">{{ </w:t>
-            </w:r>
-            <w:proofErr w:type="spellStart"/>
-            <w:r>
-              <w:t>item.nama_item</w:t>
-            </w:r>
-            <w:proofErr w:type="spellEnd"/>
-            <w:r>
-              <w:t xml:space="preserve"> }}</w:t>
+              <w:rPr>
+                <w:color w:val="000000"/>
+              </w:rPr>
+              <w:t>{{ loop.index }}</w:t>
             </w:r>
           </w:p>
         </w:tc>
@@ -801,18 +759,10 @@
           </w:tcPr>
           <w:p>
             <w:r>
-              <w:t xml:space="preserve">{{ </w:t>
-            </w:r>
-            <w:proofErr w:type="spellStart"/>
-            <w:r>
-              <w:t>item.kuantitas</w:t>
-            </w:r>
-            <w:proofErr w:type="spellEnd"/>
-            <w:r>
-              <w:t xml:space="preserve"> }}</w:t>
-            </w:r>
-            <w:r>
-              <w:t xml:space="preserve"> KG</w:t>
+              <w:rPr>
+                <w:color w:val="000000"/>
+              </w:rPr>
+              <w:t>{{ item.nama_item }}</w:t>
             </w:r>
           </w:p>
         </w:tc>
@@ -822,40 +772,76 @@
           </w:tcPr>
           <w:p>
             <w:r>
-              <w:t xml:space="preserve">{{ </w:t>
-            </w:r>
-            <w:proofErr w:type="spellStart"/>
-            <w:r>
-              <w:t>item.total_harga</w:t>
-            </w:r>
-            <w:proofErr w:type="spellEnd"/>
-            <w:r>
-              <w:t xml:space="preserve"> }} {% </w:t>
-            </w:r>
-            <w:proofErr w:type="spellStart"/>
-            <w:r>
-              <w:t>endfor</w:t>
-            </w:r>
-            <w:proofErr w:type="spellEnd"/>
-            <w:r>
-              <w:t xml:space="preserve"> %}</w:t>
+              <w:rPr>
+                <w:color w:val="000000"/>
+              </w:rPr>
+              <w:t>{{ item.kuantitas }} KG</w:t>
             </w:r>
           </w:p>
         </w:tc>
+        <w:tc>
+          <w:tcPr>
+            <w:tcW w:w="2160" w:type="dxa"/>
+          </w:tcPr>
+          <w:p>
+            <w:r>
+              <w:rPr>
+                <w:color w:val="000000"/>
+              </w:rPr>
+              <w:t xml:space="preserve">{{ item.total_harga }} </w:t>
+            </w:r>
+          </w:p>
+        </w:tc>
       </w:tr>
       <w:tr>
         <w:tc>
           <w:tcPr>
             <w:tcW w:w="2160" w:type="dxa"/>
           </w:tcPr>
-          <w:p/>
-        </w:tc>
-        <w:tc>
-          <w:tcPr>
-            <w:tcW w:w="2160" w:type="dxa"/>
-          </w:tcPr>
           <w:p>
             <w:r>
+              <w:rPr>
+                <w:color w:val="000000"/>
+              </w:rPr>
+              <w:t>{%tr endfor %}</w:t>
+            </w:r>
+          </w:p>
+        </w:tc>
+        <w:tc>
+          <w:tcPr>
+            <w:tcW w:w="2160" w:type="dxa"/>
+          </w:tcPr>
+          <w:p/>
+        </w:tc>
+        <w:tc>
+          <w:tcPr>
+            <w:tcW w:w="2160" w:type="dxa"/>
+          </w:tcPr>
+          <w:p/>
+        </w:tc>
+        <w:tc>
+          <w:tcPr>
+            <w:tcW w:w="2160" w:type="dxa"/>
+          </w:tcPr>
+          <w:p/>
+        </w:tc>
+      </w:tr>
+      <w:tr>
+        <w:tc>
+          <w:tcPr>
+            <w:tcW w:w="2160" w:type="dxa"/>
+          </w:tcPr>
+          <w:p/>
+        </w:tc>
+        <w:tc>
+          <w:tcPr>
+            <w:tcW w:w="2160" w:type="dxa"/>
+          </w:tcPr>
+          <w:p>
+            <w:r>
+              <w:rPr>
+                <w:color w:val="000000"/>
+              </w:rPr>
               <w:t>PPN 11 %</w:t>
             </w:r>
           </w:p>
@@ -872,6 +858,9 @@
           </w:tcPr>
           <w:p>
             <w:r>
+              <w:rPr>
+                <w:color w:val="000000"/>
+              </w:rPr>
               <w:t>{{ TOTAL_PPN }}</w:t>
             </w:r>
           </w:p>
@@ -890,6 +879,9 @@
           </w:tcPr>
           <w:p>
             <w:r>
+              <w:rPr>
+                <w:color w:val="000000"/>
+              </w:rPr>
               <w:t>TOTAL</w:t>
             </w:r>
           </w:p>
@@ -906,6 +898,9 @@
           </w:tcPr>
           <w:p>
             <w:r>
+              <w:rPr>
+                <w:color w:val="000000"/>
+              </w:rPr>
               <w:t>{{ TOTAL_FINAL }}</w:t>
             </w:r>
           </w:p>
@@ -951,14 +946,12 @@
         </w:rPr>
         <w:t xml:space="preserve"> </w:t>
       </w:r>
-      <w:proofErr w:type="spellStart"/>
       <w:r>
         <w:rPr>
           <w:spacing w:val="-2"/>
         </w:rPr>
         <w:t>Urgent</w:t>
       </w:r>
-      <w:proofErr w:type="spellEnd"/>
     </w:p>
     <w:p>
       <w:pPr>
@@ -1075,13 +1068,8 @@
         </w:rPr>
         <w:t xml:space="preserve"> </w:t>
       </w:r>
-      <w:proofErr w:type="spellStart"/>
-      <w:r>
-        <w:t>Ciakar</w:t>
-      </w:r>
-      <w:proofErr w:type="spellEnd"/>
-      <w:r>
-        <w:t>,</w:t>
+      <w:r>
+        <w:t>Ciakar,</w:t>
       </w:r>
       <w:r>
         <w:rPr>
@@ -1089,13 +1077,8 @@
         </w:rPr>
         <w:t xml:space="preserve"> </w:t>
       </w:r>
-      <w:proofErr w:type="spellStart"/>
-      <w:r>
-        <w:t>Cileles</w:t>
-      </w:r>
-      <w:proofErr w:type="spellEnd"/>
-      <w:r>
-        <w:t>,</w:t>
+      <w:r>
+        <w:t>Cileles,</w:t>
       </w:r>
       <w:r>
         <w:rPr>
@@ -1927,7 +1910,6 @@
   <w:style w:type="character" w:default="1" w:styleId="FontParagrafDefault">
     <w:name w:val="Default Paragraph Font"/>
     <w:uiPriority w:val="1"/>
-    <w:semiHidden/>
     <w:unhideWhenUsed/>
   </w:style>
   <w:style w:type="table" w:default="1" w:styleId="TabelNormal">

</xml_diff>